<commit_message>
Expand Chapter 6 (Conclusions & Future Scope) with comprehensive academic detail
</commit_message>
<xml_diff>
--- a/AthletIQ_Industrial_Training_Report.docx
+++ b/AthletIQ_Industrial_Training_Report.docx
@@ -13868,12 +13868,27 @@
           <w:color w:val="212529"/>
           <w:sz w:val="22"/>
         </w:rPr>
-        <w:t>The industrial training tenure successfully achieved its overarching mandate: architecting, implementing, and validating AthletIQ as an enterprise-grade sports intelligence and talent discovery platform. The key conclusions derived from this project are:</w:t>
+        <w:t>The industrial training tenure successfully achieved its overarching mandate: designing, architecting, implementing, and validating AthletIQ as an enterprise-grade sports analytics, coach capacity optimization, and talent discovery platform. The project proved that systemic information asymmetry and human-resource imbalances in grassroots sports governance can be effectively resolved through modern data engineering and multi-criteria algorithmic modeling. The following detailed conclusions are drawn from the execution of this work:</w:t>
       </w:r>
     </w:p>
     <w:p>
       <w:pPr>
-        <w:spacing w:line="300" w:lineRule="auto" w:after="120"/>
+        <w:spacing w:line="276" w:lineRule="auto" w:before="200" w:after="80"/>
+      </w:pPr>
+      <w:r>
+        <w:rPr>
+          <w:rFonts w:ascii="Times New Roman" w:hAnsi="Times New Roman"/>
+          <w:b/>
+          <w:color w:val="475569"/>
+          <w:sz w:val="23"/>
+        </w:rPr>
+        <w:t>1. Algorithmic Modeling and Objective Resource Allocation</w:t>
+      </w:r>
+    </w:p>
+    <w:p>
+      <w:pPr>
+        <w:pStyle w:val="ListBullet"/>
+        <w:spacing w:line="288" w:lineRule="auto" w:after="60"/>
         <w:jc w:val="both"/>
       </w:pPr>
       <w:r>
@@ -13883,36 +13898,21 @@
           <w:color w:val="113E21"/>
           <w:sz w:val="22"/>
         </w:rPr>
-        <w:t xml:space="preserve">1. Algorithmic Optimization: </w:t>
+        <w:t xml:space="preserve">• Outcomes: </w:t>
       </w:r>
       <w:r>
         <w:rPr>
           <w:rFonts w:ascii="Times New Roman" w:hAnsi="Times New Roman"/>
-          <w:i w:val="0"/>
           <w:color w:val="212529"/>
           <w:sz w:val="22"/>
         </w:rPr>
-        <w:t>1. Algorithmic Optimization of Sports Administration</w:t>
+        <w:t>Formulated and verified a sport-weighted capacity allocation model that derives discipline-specific intake from total facility capacity and dynamically calculates athlete-to-coach ratios against the official Sports Authority of India 15:1 standard. Successfully implemented automated surplus detection (&lt;15:1) and national deficit ranking (&gt;15:1), generating actionable bilateral coaching transfer directives across 28 accredited training centres.</w:t>
       </w:r>
     </w:p>
     <w:p>
       <w:pPr>
-        <w:spacing w:line="300" w:lineRule="auto" w:after="120"/>
-        <w:jc w:val="both"/>
-      </w:pPr>
-      <w:r>
-        <w:rPr>
-          <w:rFonts w:ascii="Times New Roman" w:hAnsi="Times New Roman"/>
-          <w:i w:val="0"/>
-          <w:color w:val="212529"/>
-          <w:sz w:val="22"/>
-        </w:rPr>
-        <w:t>The project proved that subjective administrative challenges in sports governance—such as coaching staff allocation and training academy selection—can be successfully modeled using objective mathematical formulations. The 15:1 Coach Redistribution Matrix and the 100-Point Suitability Matcher provide reliable, transparent decision-support frameworks.</w:t>
-      </w:r>
-    </w:p>
-    <w:p>
-      <w:pPr>
-        <w:spacing w:line="300" w:lineRule="auto" w:after="120"/>
+        <w:pStyle w:val="ListBullet"/>
+        <w:spacing w:line="288" w:lineRule="auto" w:after="60"/>
         <w:jc w:val="both"/>
       </w:pPr>
       <w:r>
@@ -13922,36 +13922,35 @@
           <w:color w:val="113E21"/>
           <w:sz w:val="22"/>
         </w:rPr>
-        <w:t xml:space="preserve">2. Data Engineering: </w:t>
+        <w:t xml:space="preserve">• Significance: </w:t>
       </w:r>
       <w:r>
         <w:rPr>
           <w:rFonts w:ascii="Times New Roman" w:hAnsi="Times New Roman"/>
-          <w:i w:val="0"/>
           <w:color w:val="212529"/>
           <w:sz w:val="22"/>
         </w:rPr>
-        <w:t>2. High-Performance In-Memory Data Engineering</w:t>
+        <w:t>Eliminates administrative subjectivity, political bias, and ad-hoc deputations in coaching staff management. Provides national and state sports directorates with a transparent, mathematically grounded decision-support mechanism that mitigates athlete burnout, prevents training-related injuries at strained grassroots hubs, and optimizes taxpayer-funded athletic infrastructure.</w:t>
       </w:r>
     </w:p>
     <w:p>
       <w:pPr>
-        <w:spacing w:line="300" w:lineRule="auto" w:after="120"/>
-        <w:jc w:val="both"/>
+        <w:spacing w:line="276" w:lineRule="auto" w:before="200" w:after="80"/>
       </w:pPr>
       <w:r>
         <w:rPr>
           <w:rFonts w:ascii="Times New Roman" w:hAnsi="Times New Roman"/>
-          <w:i w:val="0"/>
-          <w:color w:val="212529"/>
-          <w:sz w:val="22"/>
+          <w:b/>
+          <w:color w:val="475569"/>
+          <w:sz w:val="23"/>
         </w:rPr>
-        <w:t>By leveraging Python, Pandas, and Streamlit caching decorators, the platform successfully indices over 12,000 multi-source athletic and institutional entities, delivering sub-50ms query execution without necessitating heavyweight server infrastructure.</w:t>
+        <w:t>2. Multi-Criteria Decision Analysis for Grassroots Talent Retention</w:t>
       </w:r>
     </w:p>
     <w:p>
       <w:pPr>
-        <w:spacing w:line="300" w:lineRule="auto" w:after="120"/>
+        <w:pStyle w:val="ListBullet"/>
+        <w:spacing w:line="288" w:lineRule="auto" w:after="60"/>
         <w:jc w:val="both"/>
       </w:pPr>
       <w:r>
@@ -13961,36 +13960,21 @@
           <w:color w:val="113E21"/>
           <w:sz w:val="22"/>
         </w:rPr>
-        <w:t xml:space="preserve">3. Grounded AI Integration: </w:t>
+        <w:t xml:space="preserve">• Outcomes: </w:t>
       </w:r>
       <w:r>
         <w:rPr>
           <w:rFonts w:ascii="Times New Roman" w:hAnsi="Times New Roman"/>
-          <w:i w:val="0"/>
           <w:color w:val="212529"/>
           <w:sz w:val="22"/>
         </w:rPr>
-        <w:t>3. Practical Fusion of Generative AI with Live Grounding</w:t>
+        <w:t>Developed, validated, and stress-tested a 100-point multi-criteria suitability recommendation engine evaluating athlete profiles across five weighted dimensions: discipline availability (40 pts), geographic/state proximity (25 pts), performance tier alignment (20 pts), chronological age eligibility (10 pts), and gender boarding infrastructure (5 pts).</w:t>
       </w:r>
     </w:p>
     <w:p>
       <w:pPr>
-        <w:spacing w:line="300" w:lineRule="auto" w:after="120"/>
-        <w:jc w:val="both"/>
-      </w:pPr>
-      <w:r>
-        <w:rPr>
-          <w:rFonts w:ascii="Times New Roman" w:hAnsi="Times New Roman"/>
-          <w:i w:val="0"/>
-          <w:color w:val="212529"/>
-          <w:sz w:val="22"/>
-        </w:rPr>
-        <w:t>The integration of Google Gemini 2.5 Flash with the GoogleSearch() tool verified that generative AI can transcend static knowledge limits, reliably retrieving and parsing dynamic grassroots tournament fixtures when grounded in strict schema specifications.</w:t>
-      </w:r>
-    </w:p>
-    <w:p>
-      <w:pPr>
-        <w:spacing w:line="300" w:lineRule="auto" w:after="120"/>
+        <w:pStyle w:val="ListBullet"/>
+        <w:spacing w:line="288" w:lineRule="auto" w:after="60"/>
         <w:jc w:val="both"/>
       </w:pPr>
       <w:r>
@@ -14000,31 +13984,263 @@
           <w:color w:val="113E21"/>
           <w:sz w:val="22"/>
         </w:rPr>
-        <w:t xml:space="preserve">4. Software Engineering Rigor: </w:t>
+        <w:t xml:space="preserve">• Significance: </w:t>
       </w:r>
       <w:r>
         <w:rPr>
           <w:rFonts w:ascii="Times New Roman" w:hAnsi="Times New Roman"/>
-          <w:i w:val="0"/>
           <w:color w:val="212529"/>
           <w:sz w:val="22"/>
         </w:rPr>
-        <w:t>4. Professional Institutional Software Engineering</w:t>
+        <w:t>Directly confronts the critical 'grassroots-to-elite drop-off' phenomenon where rural and semi-urban athletes abandon competitive sports due to lack of visibility into accredited academies. Intelligently prioritizes home-state institutions while providing transparent zonal fallbacks for specialized infrastructure (e.g., Fencing, Cycling velodromes, or Rowing channels), ensuring athletes are routed to environments matching their developmental caliber.</w:t>
       </w:r>
     </w:p>
     <w:p>
       <w:pPr>
-        <w:spacing w:line="300" w:lineRule="auto" w:after="120"/>
+        <w:spacing w:line="276" w:lineRule="auto" w:before="200" w:after="80"/>
+      </w:pPr>
+      <w:r>
+        <w:rPr>
+          <w:rFonts w:ascii="Times New Roman" w:hAnsi="Times New Roman"/>
+          <w:b/>
+          <w:color w:val="475569"/>
+          <w:sz w:val="23"/>
+        </w:rPr>
+        <w:t>3. High-Performance In-Memory Data Engineering on Low Operational Overhead</w:t>
+      </w:r>
+    </w:p>
+    <w:p>
+      <w:pPr>
+        <w:pStyle w:val="ListBullet"/>
+        <w:spacing w:line="288" w:lineRule="auto" w:after="60"/>
         <w:jc w:val="both"/>
       </w:pPr>
       <w:r>
         <w:rPr>
           <w:rFonts w:ascii="Times New Roman" w:hAnsi="Times New Roman"/>
-          <w:i w:val="0"/>
+          <w:b/>
+          <w:color w:val="113E21"/>
+          <w:sz w:val="22"/>
+        </w:rPr>
+        <w:t xml:space="preserve">• Outcomes: </w:t>
+      </w:r>
+      <w:r>
+        <w:rPr>
+          <w:rFonts w:ascii="Times New Roman" w:hAnsi="Times New Roman"/>
           <w:color w:val="212529"/>
           <w:sz w:val="22"/>
         </w:rPr>
-        <w:t>Adhering to Agile development practices across seven sprints ensured steady incremental delivery, comprehensive functional test coverage, and robust error-handling, producing a production-ready application aligned with institutional standards.</w:t>
+        <w:t>Engineered an in-memory columnar analytical pipeline utilizing Python, Pandas, and Streamlit caching decorators that processes 7,634 master athlete and coach records, 28 accredited SAI campuses, and a dedicated 5,000-record emerging women athletes registry with query response latencies consistently under 50 milliseconds.</w:t>
+      </w:r>
+    </w:p>
+    <w:p>
+      <w:pPr>
+        <w:pStyle w:val="ListBullet"/>
+        <w:spacing w:line="288" w:lineRule="auto" w:after="60"/>
+        <w:jc w:val="both"/>
+      </w:pPr>
+      <w:r>
+        <w:rPr>
+          <w:rFonts w:ascii="Times New Roman" w:hAnsi="Times New Roman"/>
+          <w:b/>
+          <w:color w:val="113E21"/>
+          <w:sz w:val="22"/>
+        </w:rPr>
+        <w:t xml:space="preserve">• Significance: </w:t>
+      </w:r>
+      <w:r>
+        <w:rPr>
+          <w:rFonts w:ascii="Times New Roman" w:hAnsi="Times New Roman"/>
+          <w:color w:val="212529"/>
+          <w:sz w:val="22"/>
+        </w:rPr>
+        <w:t>Proves that institutional sports intelligence tools do not require multi-tier distributed server clusters or expensive enterprise software licenses to deliver high-performance discovery. A lightweight, reactive in-memory architecture delivers exceptional responsiveness, zero server management overhead, and instantaneous deployment readiness for resource-constrained state sports departments.</w:t>
+      </w:r>
+    </w:p>
+    <w:p>
+      <w:pPr>
+        <w:spacing w:line="276" w:lineRule="auto" w:before="200" w:after="80"/>
+      </w:pPr>
+      <w:r>
+        <w:rPr>
+          <w:rFonts w:ascii="Times New Roman" w:hAnsi="Times New Roman"/>
+          <w:b/>
+          <w:color w:val="475569"/>
+          <w:sz w:val="23"/>
+        </w:rPr>
+        <w:t>4. Practical Integration of Generative AI with Live Grounded Search</w:t>
+      </w:r>
+    </w:p>
+    <w:p>
+      <w:pPr>
+        <w:pStyle w:val="ListBullet"/>
+        <w:spacing w:line="288" w:lineRule="auto" w:after="60"/>
+        <w:jc w:val="both"/>
+      </w:pPr>
+      <w:r>
+        <w:rPr>
+          <w:rFonts w:ascii="Times New Roman" w:hAnsi="Times New Roman"/>
+          <w:b/>
+          <w:color w:val="113E21"/>
+          <w:sz w:val="22"/>
+        </w:rPr>
+        <w:t xml:space="preserve">• Outcomes: </w:t>
+      </w:r>
+      <w:r>
+        <w:rPr>
+          <w:rFonts w:ascii="Times New Roman" w:hAnsi="Times New Roman"/>
+          <w:color w:val="212529"/>
+          <w:sz w:val="22"/>
+        </w:rPr>
+        <w:t>Successfully interfaced Google Gemini 2.5 Flash with the GoogleSearch() retrieval tool, enforcing strict JSON output schemas to automatically discover, scrape, and structure live grassroots tournaments, junior selection trials, and Khelo India leagues directly from public sports portals, backed by a robust fallback generator.</w:t>
+      </w:r>
+    </w:p>
+    <w:p>
+      <w:pPr>
+        <w:pStyle w:val="ListBullet"/>
+        <w:spacing w:line="288" w:lineRule="auto" w:after="60"/>
+        <w:jc w:val="both"/>
+      </w:pPr>
+      <w:r>
+        <w:rPr>
+          <w:rFonts w:ascii="Times New Roman" w:hAnsi="Times New Roman"/>
+          <w:b/>
+          <w:color w:val="113E21"/>
+          <w:sz w:val="22"/>
+        </w:rPr>
+        <w:t xml:space="preserve">• Significance: </w:t>
+      </w:r>
+      <w:r>
+        <w:rPr>
+          <w:rFonts w:ascii="Times New Roman" w:hAnsi="Times New Roman"/>
+          <w:color w:val="212529"/>
+          <w:sz w:val="22"/>
+        </w:rPr>
+        <w:t>Bridges the gap between static databases and dynamic real-world calendars. Overcomes the chronic data obsolescence plaguing legacy sports administration platforms by equipping administrators with real-time tournament signals without requiring continuous manual data-entry staffing.</w:t>
+      </w:r>
+    </w:p>
+    <w:p>
+      <w:pPr>
+        <w:spacing w:line="276" w:lineRule="auto" w:before="200" w:after="80"/>
+      </w:pPr>
+      <w:r>
+        <w:rPr>
+          <w:rFonts w:ascii="Times New Roman" w:hAnsi="Times New Roman"/>
+          <w:b/>
+          <w:color w:val="475569"/>
+          <w:sz w:val="23"/>
+        </w:rPr>
+        <w:t>5. Human-Centric Institutional UI/UX and State Synchronization</w:t>
+      </w:r>
+    </w:p>
+    <w:p>
+      <w:pPr>
+        <w:pStyle w:val="ListBullet"/>
+        <w:spacing w:line="288" w:lineRule="auto" w:after="60"/>
+        <w:jc w:val="both"/>
+      </w:pPr>
+      <w:r>
+        <w:rPr>
+          <w:rFonts w:ascii="Times New Roman" w:hAnsi="Times New Roman"/>
+          <w:b/>
+          <w:color w:val="113E21"/>
+          <w:sz w:val="22"/>
+        </w:rPr>
+        <w:t xml:space="preserve">• Outcomes: </w:t>
+      </w:r>
+      <w:r>
+        <w:rPr>
+          <w:rFonts w:ascii="Times New Roman" w:hAnsi="Times New Roman"/>
+          <w:color w:val="212529"/>
+          <w:sz w:val="22"/>
+        </w:rPr>
+        <w:t>Implemented a cohesive design system (Fraunces editorial serif, Inter sans, IBM Plex Mono, forest green #113E21 and gold #B38B59), adopted the index=None empty-focus search paradigm to eliminate pre-selected text deletion, and established robust session-state machine handling for cross-tab redirection from state nursery cards to profile registries.</w:t>
+      </w:r>
+    </w:p>
+    <w:p>
+      <w:pPr>
+        <w:pStyle w:val="ListBullet"/>
+        <w:spacing w:line="288" w:lineRule="auto" w:after="60"/>
+        <w:jc w:val="both"/>
+      </w:pPr>
+      <w:r>
+        <w:rPr>
+          <w:rFonts w:ascii="Times New Roman" w:hAnsi="Times New Roman"/>
+          <w:b/>
+          <w:color w:val="113E21"/>
+          <w:sz w:val="22"/>
+        </w:rPr>
+        <w:t xml:space="preserve">• Significance: </w:t>
+      </w:r>
+      <w:r>
+        <w:rPr>
+          <w:rFonts w:ascii="Times New Roman" w:hAnsi="Times New Roman"/>
+          <w:color w:val="212529"/>
+          <w:sz w:val="22"/>
+        </w:rPr>
+        <w:t>Demonstrates that public sector analytics tools must prioritize cognitive ergonomics. Eliminating default data clutter and pre-populated search boxes dramatically streamlines candidate lookup for talent scouts, academy directors, and corporate CSR grant committees during time-critical scouting workflows.</w:t>
+      </w:r>
+    </w:p>
+    <w:p>
+      <w:pPr>
+        <w:spacing w:line="276" w:lineRule="auto" w:before="200" w:after="80"/>
+      </w:pPr>
+      <w:r>
+        <w:rPr>
+          <w:rFonts w:ascii="Times New Roman" w:hAnsi="Times New Roman"/>
+          <w:b/>
+          <w:color w:val="475569"/>
+          <w:sz w:val="23"/>
+        </w:rPr>
+        <w:t>6. Agile Engineering Discipline and Rigorous Validation</w:t>
+      </w:r>
+    </w:p>
+    <w:p>
+      <w:pPr>
+        <w:pStyle w:val="ListBullet"/>
+        <w:spacing w:line="288" w:lineRule="auto" w:after="60"/>
+        <w:jc w:val="both"/>
+      </w:pPr>
+      <w:r>
+        <w:rPr>
+          <w:rFonts w:ascii="Times New Roman" w:hAnsi="Times New Roman"/>
+          <w:b/>
+          <w:color w:val="113E21"/>
+          <w:sz w:val="22"/>
+        </w:rPr>
+        <w:t xml:space="preserve">• Outcomes: </w:t>
+      </w:r>
+      <w:r>
+        <w:rPr>
+          <w:rFonts w:ascii="Times New Roman" w:hAnsi="Times New Roman"/>
+          <w:color w:val="212529"/>
+          <w:sz w:val="22"/>
+        </w:rPr>
+        <w:t>Delivered the complete platform across seven iterative sprints, maintaining a prioritized product backlog, and validating 18 comprehensive functional test cases covering valid executions, edge cases, fallback routines, and error scenarios with 100% pass rates.</w:t>
+      </w:r>
+    </w:p>
+    <w:p>
+      <w:pPr>
+        <w:pStyle w:val="ListBullet"/>
+        <w:spacing w:line="288" w:lineRule="auto" w:after="60"/>
+        <w:jc w:val="both"/>
+      </w:pPr>
+      <w:r>
+        <w:rPr>
+          <w:rFonts w:ascii="Times New Roman" w:hAnsi="Times New Roman"/>
+          <w:b/>
+          <w:color w:val="113E21"/>
+          <w:sz w:val="22"/>
+        </w:rPr>
+        <w:t xml:space="preserve">• Significance: </w:t>
+      </w:r>
+      <w:r>
+        <w:rPr>
+          <w:rFonts w:ascii="Times New Roman" w:hAnsi="Times New Roman"/>
+          <w:color w:val="212529"/>
+          <w:sz w:val="22"/>
+        </w:rPr>
+        <w:t>Instilled professional software engineering habits: code reviews, iterative stakeholder feedback loops, honest recording of technical limitations, and structured architectural documentation essential for long-term software maintainability and enterprise handover.</w:t>
       </w:r>
     </w:p>
     <w:p>
@@ -14053,7 +14269,21 @@
           <w:color w:val="212529"/>
           <w:sz w:val="22"/>
         </w:rPr>
-        <w:t>To advance AthletIQ from its current proven prototype into a nationwide production deployment, the following enhancements are recommended:</w:t>
+        <w:t>The current AthletIQ platform establishes a robust and functional analytical foundation. To advance the system from a proven prototype into a nationwide production deployment supporting state federations, the following concrete architectural extensions are recommended:</w:t>
+      </w:r>
+    </w:p>
+    <w:p>
+      <w:pPr>
+        <w:spacing w:line="276" w:lineRule="auto" w:before="200" w:after="80"/>
+      </w:pPr>
+      <w:r>
+        <w:rPr>
+          <w:rFonts w:ascii="Times New Roman" w:hAnsi="Times New Roman"/>
+          <w:b/>
+          <w:color w:val="475569"/>
+          <w:sz w:val="23"/>
+        </w:rPr>
+        <w:t>1. Cloud Relational Database Migration &amp; Role-Based Access Control (RBAC)</w:t>
       </w:r>
     </w:p>
     <w:p>
@@ -14069,7 +14299,7 @@
           <w:color w:val="113E21"/>
           <w:sz w:val="22"/>
         </w:rPr>
-        <w:t xml:space="preserve">1. Cloud PostgreSQL Migration &amp; Role-Based Access Control (RBAC): </w:t>
+        <w:t xml:space="preserve">• Objective: </w:t>
       </w:r>
       <w:r>
         <w:rPr>
@@ -14077,7 +14307,7 @@
           <w:color w:val="212529"/>
           <w:sz w:val="22"/>
         </w:rPr>
-        <w:t>Migrate flat-file CSV and JSON datasets to an enterprise relational database (such as PostgreSQL managed via Supabase or AWS RDS), establishing authenticated user roles (Administrators, Coaches, Scouts, Corporate Sponsors) with strict row-level security.</w:t>
+        <w:t>Transition the platform from local flat-file storage to an enterprise-grade cloud relational database (PostgreSQL managed via Supabase or AWS RDS) with multi-tenant row-level security.</w:t>
       </w:r>
     </w:p>
     <w:p>
@@ -14093,7 +14323,7 @@
           <w:color w:val="113E21"/>
           <w:sz w:val="22"/>
         </w:rPr>
-        <w:t xml:space="preserve">2. True Geocoded Haversine Proximity Engine: </w:t>
+        <w:t xml:space="preserve">• Approach: </w:t>
       </w:r>
       <w:r>
         <w:rPr>
@@ -14101,7 +14331,7 @@
           <w:color w:val="212529"/>
           <w:sz w:val="22"/>
         </w:rPr>
-        <w:t>Integrate geospatial coordinates (latitude and longitude) for every district sports council and SAI hostel, replacing categorical proximity matching with precise kilometric Haversine distance and travel time estimates.</w:t>
+        <w:t>Establish dedicated relational tables for athletes, coaching deployments, facilities, and CSR contributions via SQLAlchemy ORM. Implement Role-Based Access Control (RBAC) with distinct authorization tiers: Super-Administrators (Ministry / SAI HQ), Facility Directors (regional campus managers), Certified Scouts (talent evaluators), and Corporate CSR Officers.</w:t>
       </w:r>
     </w:p>
     <w:p>
@@ -14117,7 +14347,7 @@
           <w:color w:val="113E21"/>
           <w:sz w:val="22"/>
         </w:rPr>
-        <w:t xml:space="preserve">3. One-Click PDF Scouting &amp; CSR Pitch Export Engine: </w:t>
+        <w:t xml:space="preserve">• Significance: </w:t>
       </w:r>
       <w:r>
         <w:rPr>
@@ -14125,7 +14355,21 @@
           <w:color w:val="212529"/>
           <w:sz w:val="22"/>
         </w:rPr>
-        <w:t>Incorporate an automated PDF generation library (such as ReportLab or WeasyPrint) enabling talent scouts to export multi-page athlete scouting dossiers and corporate CSR sponsorship pitch decks with one click.</w:t>
+        <w:t>Enables multi-user concurrent operations, real-time remote updates, persistent candidate bookmarking/shortlisting by recruiters, and compliance with national digital personal data protection mandates.</w:t>
+      </w:r>
+    </w:p>
+    <w:p>
+      <w:pPr>
+        <w:spacing w:line="276" w:lineRule="auto" w:before="200" w:after="80"/>
+      </w:pPr>
+      <w:r>
+        <w:rPr>
+          <w:rFonts w:ascii="Times New Roman" w:hAnsi="Times New Roman"/>
+          <w:b/>
+          <w:color w:val="475569"/>
+          <w:sz w:val="23"/>
+        </w:rPr>
+        <w:t>2. True Geocoded Haversine Proximity &amp; Transit Time Engine</w:t>
       </w:r>
     </w:p>
     <w:p>
@@ -14141,7 +14385,7 @@
           <w:color w:val="113E21"/>
           <w:sz w:val="22"/>
         </w:rPr>
-        <w:t xml:space="preserve">4. Head-to-Head Athlete Comparative Radar Analytics: </w:t>
+        <w:t xml:space="preserve">• Objective: </w:t>
       </w:r>
       <w:r>
         <w:rPr>
@@ -14149,7 +14393,7 @@
           <w:color w:val="212529"/>
           <w:sz w:val="22"/>
         </w:rPr>
-        <w:t>Develop interactive head-to-head comparison modules utilizing multi-axial Plotly radar charts to benchmark physical metrics, podium consistency, and historical progression curves between competing athletes in identical weight categories.</w:t>
+        <w:t>Replace categorical state-level proximity scoring with exact geographic distances and transit logistics.</w:t>
       </w:r>
     </w:p>
     <w:p>
@@ -14165,7 +14409,7 @@
           <w:color w:val="113E21"/>
           <w:sz w:val="22"/>
         </w:rPr>
-        <w:t xml:space="preserve">5. Micro-Modular Codebase Refactoring: </w:t>
+        <w:t xml:space="preserve">• Approach: </w:t>
       </w:r>
       <w:r>
         <w:rPr>
@@ -14173,7 +14417,289 @@
           <w:color w:val="212529"/>
           <w:sz w:val="22"/>
         </w:rPr>
-        <w:t>Refactor the monolithic dashboard.py script into isolated, domain-specific packages (e.g., app/routers, app/services, app/styles, app/views) to facilitate continuous integration and modular feature expansion.</w:t>
+        <w:t>Geocode all 700+ Indian district sports councils and 28+ accredited SAI campuses with precise latitude and longitude coordinates. Implement the spherical Haversine distance formula and integrate public transit/railway distance APIs.</w:t>
+      </w:r>
+    </w:p>
+    <w:p>
+      <w:pPr>
+        <w:pStyle w:val="ListBullet"/>
+        <w:spacing w:line="288" w:lineRule="auto" w:after="60"/>
+        <w:jc w:val="both"/>
+      </w:pPr>
+      <w:r>
+        <w:rPr>
+          <w:rFonts w:ascii="Times New Roman" w:hAnsi="Times New Roman"/>
+          <w:b/>
+          <w:color w:val="113E21"/>
+          <w:sz w:val="22"/>
+        </w:rPr>
+        <w:t xml:space="preserve">• Significance: </w:t>
+      </w:r>
+      <w:r>
+        <w:rPr>
+          <w:rFonts w:ascii="Times New Roman" w:hAnsi="Times New Roman"/>
+          <w:color w:val="212529"/>
+          <w:sz w:val="22"/>
+        </w:rPr>
+        <w:t>Reflects real-world travel logistics. A rural athlete located on a state border may live 35 km from an academy in an adjacent state but 450 km from their own state capital academy. Accurate transit modeling prevents misguided residential relocations.</w:t>
+      </w:r>
+    </w:p>
+    <w:p>
+      <w:pPr>
+        <w:spacing w:line="276" w:lineRule="auto" w:before="200" w:after="80"/>
+      </w:pPr>
+      <w:r>
+        <w:rPr>
+          <w:rFonts w:ascii="Times New Roman" w:hAnsi="Times New Roman"/>
+          <w:b/>
+          <w:color w:val="475569"/>
+          <w:sz w:val="23"/>
+        </w:rPr>
+        <w:t>3. Automated PDF Scouting Dossier &amp; CSR Grant Pitch Export Engine</w:t>
+      </w:r>
+    </w:p>
+    <w:p>
+      <w:pPr>
+        <w:pStyle w:val="ListBullet"/>
+        <w:spacing w:line="288" w:lineRule="auto" w:after="60"/>
+        <w:jc w:val="both"/>
+      </w:pPr>
+      <w:r>
+        <w:rPr>
+          <w:rFonts w:ascii="Times New Roman" w:hAnsi="Times New Roman"/>
+          <w:b/>
+          <w:color w:val="113E21"/>
+          <w:sz w:val="22"/>
+        </w:rPr>
+        <w:t xml:space="preserve">• Objective: </w:t>
+      </w:r>
+      <w:r>
+        <w:rPr>
+          <w:rFonts w:ascii="Times New Roman" w:hAnsi="Times New Roman"/>
+          <w:color w:val="212529"/>
+          <w:sz w:val="22"/>
+        </w:rPr>
+        <w:t>Provide 1-click exportable, board-ready documentary deliverables for recruiters and corporate donors.</w:t>
+      </w:r>
+    </w:p>
+    <w:p>
+      <w:pPr>
+        <w:pStyle w:val="ListBullet"/>
+        <w:spacing w:line="288" w:lineRule="auto" w:after="60"/>
+        <w:jc w:val="both"/>
+      </w:pPr>
+      <w:r>
+        <w:rPr>
+          <w:rFonts w:ascii="Times New Roman" w:hAnsi="Times New Roman"/>
+          <w:b/>
+          <w:color w:val="113E21"/>
+          <w:sz w:val="22"/>
+        </w:rPr>
+        <w:t xml:space="preserve">• Approach: </w:t>
+      </w:r>
+      <w:r>
+        <w:rPr>
+          <w:rFonts w:ascii="Times New Roman" w:hAnsi="Times New Roman"/>
+          <w:color w:val="212529"/>
+          <w:sz w:val="22"/>
+        </w:rPr>
+        <w:t>Integrate headless PDF generation libraries (such as WeasyPrint or ReportLab) to compile structured athlete dossiers (biographical metrics, TOPS history, coach recommendations, injury history) and corporate CSR sponsorship pitch decks into downloadable, branded PDF documents.</w:t>
+      </w:r>
+    </w:p>
+    <w:p>
+      <w:pPr>
+        <w:pStyle w:val="ListBullet"/>
+        <w:spacing w:line="288" w:lineRule="auto" w:after="60"/>
+        <w:jc w:val="both"/>
+      </w:pPr>
+      <w:r>
+        <w:rPr>
+          <w:rFonts w:ascii="Times New Roman" w:hAnsi="Times New Roman"/>
+          <w:b/>
+          <w:color w:val="113E21"/>
+          <w:sz w:val="22"/>
+        </w:rPr>
+        <w:t xml:space="preserve">• Significance: </w:t>
+      </w:r>
+      <w:r>
+        <w:rPr>
+          <w:rFonts w:ascii="Times New Roman" w:hAnsi="Times New Roman"/>
+          <w:color w:val="212529"/>
+          <w:sz w:val="22"/>
+        </w:rPr>
+        <w:t>Sports scouts, academy directors, and CSR committee members operate in boardrooms and training fields where offline paper documentation and printable executive briefs are essential for funding approvals.</w:t>
+      </w:r>
+    </w:p>
+    <w:p>
+      <w:pPr>
+        <w:spacing w:line="276" w:lineRule="auto" w:before="200" w:after="80"/>
+      </w:pPr>
+      <w:r>
+        <w:rPr>
+          <w:rFonts w:ascii="Times New Roman" w:hAnsi="Times New Roman"/>
+          <w:b/>
+          <w:color w:val="475569"/>
+          <w:sz w:val="23"/>
+        </w:rPr>
+        <w:t>4. Head-to-Head Athlete Comparative Radar Analytics</w:t>
+      </w:r>
+    </w:p>
+    <w:p>
+      <w:pPr>
+        <w:pStyle w:val="ListBullet"/>
+        <w:spacing w:line="288" w:lineRule="auto" w:after="60"/>
+        <w:jc w:val="both"/>
+      </w:pPr>
+      <w:r>
+        <w:rPr>
+          <w:rFonts w:ascii="Times New Roman" w:hAnsi="Times New Roman"/>
+          <w:b/>
+          <w:color w:val="113E21"/>
+          <w:sz w:val="22"/>
+        </w:rPr>
+        <w:t xml:space="preserve">• Objective: </w:t>
+      </w:r>
+      <w:r>
+        <w:rPr>
+          <w:rFonts w:ascii="Times New Roman" w:hAnsi="Times New Roman"/>
+          <w:color w:val="212529"/>
+          <w:sz w:val="22"/>
+        </w:rPr>
+        <w:t>Enable multi-athlete side-by-side benchmarking within identical sport disciplines and weight categories.</w:t>
+      </w:r>
+    </w:p>
+    <w:p>
+      <w:pPr>
+        <w:pStyle w:val="ListBullet"/>
+        <w:spacing w:line="288" w:lineRule="auto" w:after="60"/>
+        <w:jc w:val="both"/>
+      </w:pPr>
+      <w:r>
+        <w:rPr>
+          <w:rFonts w:ascii="Times New Roman" w:hAnsi="Times New Roman"/>
+          <w:b/>
+          <w:color w:val="113E21"/>
+          <w:sz w:val="22"/>
+        </w:rPr>
+        <w:t xml:space="preserve">• Approach: </w:t>
+      </w:r>
+      <w:r>
+        <w:rPr>
+          <w:rFonts w:ascii="Times New Roman" w:hAnsi="Times New Roman"/>
+          <w:color w:val="212529"/>
+          <w:sz w:val="22"/>
+        </w:rPr>
+        <w:t>Build an interactive comparison module utilizing Plotly Express radar/spider charts. Normalize metrics across five key axes: Podium Consistency, Tactical Execution, Win-Loss Ratio, Age vs Peak Trajectory Curve, and National Ranking Velocity.</w:t>
+      </w:r>
+    </w:p>
+    <w:p>
+      <w:pPr>
+        <w:pStyle w:val="ListBullet"/>
+        <w:spacing w:line="288" w:lineRule="auto" w:after="60"/>
+        <w:jc w:val="both"/>
+      </w:pPr>
+      <w:r>
+        <w:rPr>
+          <w:rFonts w:ascii="Times New Roman" w:hAnsi="Times New Roman"/>
+          <w:b/>
+          <w:color w:val="113E21"/>
+          <w:sz w:val="22"/>
+        </w:rPr>
+        <w:t xml:space="preserve">• Significance: </w:t>
+      </w:r>
+      <w:r>
+        <w:rPr>
+          <w:rFonts w:ascii="Times New Roman" w:hAnsi="Times New Roman"/>
+          <w:color w:val="212529"/>
+          <w:sz w:val="22"/>
+        </w:rPr>
+        <w:t>Solves the agonizing selection dilemmas faced by national trial committees, providing objective visual and statistical justification when selecting between closely matched prospects for international deputation.</w:t>
+      </w:r>
+    </w:p>
+    <w:p>
+      <w:pPr>
+        <w:spacing w:line="276" w:lineRule="auto" w:before="200" w:after="80"/>
+      </w:pPr>
+      <w:r>
+        <w:rPr>
+          <w:rFonts w:ascii="Times New Roman" w:hAnsi="Times New Roman"/>
+          <w:b/>
+          <w:color w:val="475569"/>
+          <w:sz w:val="23"/>
+        </w:rPr>
+        <w:t>5. Micro-Modular Architectural Refactoring &amp; REST API Decoupling</w:t>
+      </w:r>
+    </w:p>
+    <w:p>
+      <w:pPr>
+        <w:pStyle w:val="ListBullet"/>
+        <w:spacing w:line="288" w:lineRule="auto" w:after="60"/>
+        <w:jc w:val="both"/>
+      </w:pPr>
+      <w:r>
+        <w:rPr>
+          <w:rFonts w:ascii="Times New Roman" w:hAnsi="Times New Roman"/>
+          <w:b/>
+          <w:color w:val="113E21"/>
+          <w:sz w:val="22"/>
+        </w:rPr>
+        <w:t xml:space="preserve">• Objective: </w:t>
+      </w:r>
+      <w:r>
+        <w:rPr>
+          <w:rFonts w:ascii="Times New Roman" w:hAnsi="Times New Roman"/>
+          <w:color w:val="212529"/>
+          <w:sz w:val="22"/>
+        </w:rPr>
+        <w:t>Decompose the monolithic app/dashboard.py script into an enterprise-grade modular software package.</w:t>
+      </w:r>
+    </w:p>
+    <w:p>
+      <w:pPr>
+        <w:pStyle w:val="ListBullet"/>
+        <w:spacing w:line="288" w:lineRule="auto" w:after="60"/>
+        <w:jc w:val="both"/>
+      </w:pPr>
+      <w:r>
+        <w:rPr>
+          <w:rFonts w:ascii="Times New Roman" w:hAnsi="Times New Roman"/>
+          <w:b/>
+          <w:color w:val="113E21"/>
+          <w:sz w:val="22"/>
+        </w:rPr>
+        <w:t xml:space="preserve">• Approach: </w:t>
+      </w:r>
+      <w:r>
+        <w:rPr>
+          <w:rFonts w:ascii="Times New Roman" w:hAnsi="Times New Roman"/>
+          <w:color w:val="212529"/>
+          <w:sz w:val="22"/>
+        </w:rPr>
+        <w:t>Re-architect the codebase into clean micro-modules: app/core (config, database connectors), app/services (redistribution math, 100-pt matcher, Gemini AI engine), app/views (isolated tab components), and expose a FastAPI / Flask REST API layer serving decoupled React / Next.js or Streamlit clients.</w:t>
+      </w:r>
+    </w:p>
+    <w:p>
+      <w:pPr>
+        <w:pStyle w:val="ListBullet"/>
+        <w:spacing w:line="288" w:lineRule="auto" w:after="60"/>
+        <w:jc w:val="both"/>
+      </w:pPr>
+      <w:r>
+        <w:rPr>
+          <w:rFonts w:ascii="Times New Roman" w:hAnsi="Times New Roman"/>
+          <w:b/>
+          <w:color w:val="113E21"/>
+          <w:sz w:val="22"/>
+        </w:rPr>
+        <w:t xml:space="preserve">• Significance: </w:t>
+      </w:r>
+      <w:r>
+        <w:rPr>
+          <w:rFonts w:ascii="Times New Roman" w:hAnsi="Times New Roman"/>
+          <w:color w:val="212529"/>
+          <w:sz w:val="22"/>
+        </w:rPr>
+        <w:t>Improves testability, enables concurrent multi-developer contributions without Git merge conflicts, facilitates independent unit test automation, and lays the foundation for a mobile application (Flutter / React Native) for field scouts.</w:t>
       </w:r>
     </w:p>
     <w:p>

</xml_diff>